<commit_message>
fix: apply default text size and spacing when a document omits its defaults
Apply default text size and spacing when a document omits its defaults.

Fixes #1075
</commit_message>
<xml_diff>
--- a/packages/docx-to-markdown/test/fixtures/narrow-pages.docx
+++ b/packages/docx-to-markdown/test/fixtures/narrow-pages.docx
@@ -158,4 +158,17 @@
     </w:sectPr>
   </w:body>
 </w:document>
+</file>
+
+<file path=word/styles.xml><?xml version="1.0" encoding="utf-8"?>
+<w:styles xmlns:w="http://schemas.openxmlformats.org/wordprocessingml/2006/main">
+  <w:docDefaults>
+    <w:rPrDefault>
+      <w:rPr>
+        <w:kern w:val="2"/>
+      </w:rPr>
+    </w:rPrDefault>
+    <w:pPrDefault/>
+  </w:docDefaults>
+</w:styles>
 </file>
</xml_diff>